<commit_message>
Deploy preview for PR 545 🛫
</commit_message>
<xml_diff>
--- a/pr-preview/pr-545/vignettes/articles/enteric_fever_example.docx
+++ b/pr-preview/pr-545/vignettes/articles/enteric_fever_example.docx
@@ -5735,7 +5735,7 @@
         <w:rPr>
           <w:rStyle w:val="CommentTok"/>
         </w:rPr>
-        <w:t xml:space="preserve">#&gt; 1       0.1          0.158 0.0214  0.122  0.206 cluster-robust     0.95  -1016.</w:t>
+        <w:t xml:space="preserve">#&gt; 1       0.1          0.158 0.0218  0.121  0.207 cluster-robust     0.95  -1016.</w:t>
       </w:r>
       <w:r>
         <w:br/>
@@ -6694,16 +6694,16 @@
         <w:rPr>
           <w:rStyle w:val="CommentTok"/>
         </w:rPr>
-        <w:t xml:space="preserve">#&gt; 1 Stratum… aku         100       0.1          0.114 0.0216 0.0788  0.165 cluste…</w:t>
-      </w:r>
-      <w:r>
-        <w:br/>
-      </w:r>
-      <w:r>
-        <w:rPr>
-          <w:rStyle w:val="CommentTok"/>
-        </w:rPr>
-        <w:t xml:space="preserve">#&gt; 2 Stratum… kgh         100       0.1          0.217 0.0161 0.188   0.251 cluste…</w:t>
+        <w:t xml:space="preserve">#&gt; 1 Stratum… aku         100       0.1          0.114 0.0223 0.0779  0.167 cluste…</w:t>
+      </w:r>
+      <w:r>
+        <w:br/>
+      </w:r>
+      <w:r>
+        <w:rPr>
+          <w:rStyle w:val="CommentTok"/>
+        </w:rPr>
+        <w:t xml:space="preserve">#&gt; 2 Stratum… kgh         100       0.1          0.217 0.0170 0.186   0.253 cluste…</w:t>
       </w:r>
       <w:r>
         <w:br/>
@@ -8593,7 +8593,7 @@
         <w:rPr>
           <w:rStyle w:val="CommentTok"/>
         </w:rPr>
-        <w:t xml:space="preserve">#&gt; z = 54.102, p-value &lt; 2.2e-16</w:t>
+        <w:t xml:space="preserve">#&gt; z = 43.767, p-value &lt; 2.2e-16</w:t>
       </w:r>
       <w:r>
         <w:br/>
@@ -8620,7 +8620,7 @@
         <w:rPr>
           <w:rStyle w:val="CommentTok"/>
         </w:rPr>
-        <w:t xml:space="preserve">#&gt;  0.5156917 0.5544605</w:t>
+        <w:t xml:space="preserve">#&gt;  0.5111144 0.5590378</w:t>
       </w:r>
       <w:r>
         <w:br/>
@@ -8746,7 +8746,7 @@
         <w:rPr>
           <w:rStyle w:val="CommentTok"/>
         </w:rPr>
-        <w:t xml:space="preserve">#&gt; z = 19.126, p-value &lt; 2.2e-16</w:t>
+        <w:t xml:space="preserve">#&gt; z = 17.986, p-value &lt; 2.2e-16</w:t>
       </w:r>
       <w:r>
         <w:br/>
@@ -8773,7 +8773,7 @@
         <w:rPr>
           <w:rStyle w:val="CommentTok"/>
         </w:rPr>
-        <w:t xml:space="preserve">#&gt;  0.3859467 0.4740769</w:t>
+        <w:t xml:space="preserve">#&gt;  0.3831522 0.4768714</w:t>
       </w:r>
       <w:r>
         <w:br/>
@@ -8899,7 +8899,7 @@
         <w:rPr>
           <w:rStyle w:val="CommentTok"/>
         </w:rPr>
-        <w:t xml:space="preserve">#&gt; z = -4.67, p-value = 3.012e-06</w:t>
+        <w:t xml:space="preserve">#&gt; z = -4.5776, p-value = 4.704e-06</w:t>
       </w:r>
       <w:r>
         <w:br/>
@@ -8926,7 +8926,7 @@
         <w:rPr>
           <w:rStyle w:val="CommentTok"/>
         </w:rPr>
-        <w:t xml:space="preserve">#&gt;  -0.14915874 -0.06096985</w:t>
+        <w:t xml:space="preserve">#&gt;  -0.15004928 -0.06007931</w:t>
       </w:r>
       <w:r>
         <w:br/>
@@ -8980,7 +8980,7 @@
         <w:pStyle w:val="FirstParagraph"/>
       </w:pPr>
       <w:r>
-        <w:t xml:space="preserve">Using cluster-robust standard errors to account for geographic clustering in the SEES study, we observe significant variation in enteric fever seroconversion rates across the three countries. Bangladesh has the highest overall seroconversion rate at 588.4 per 1000 person-years (95% CI: 574.9-602.2), followed by Pakistan at 158.4 per 1000 person-years (95% CI: 121.6-206.3), and Nepal at 53.3 per 1000 person-years (95% CI: 41.2-69). Pairwise comparisons show Bangladesh has significantly higher rates than both Nepal (p &lt; 0.001) and Pakistan (p &lt; 0.001), while the difference between Nepal and Pakistan is also significant (p &lt; 0.001).</w:t>
+        <w:t xml:space="preserve">Using cluster-robust standard errors to account for geographic clustering in the SEES study, we observe significant variation in enteric fever seroconversion rates across the three countries. Bangladesh has the highest overall seroconversion rate at 588.4 per 1000 person-years (95% CI: 569.4-608), followed by Pakistan at 158.4 per 1000 person-years (95% CI: 120.9-207.4), and Nepal at 53.3 per 1000 person-years (95% CI: 40.9-69.5). Pairwise comparisons show Bangladesh has significantly higher rates than both Nepal (p &lt; 0.001) and Pakistan (p &lt; 0.001), while the difference between Nepal and Pakistan is also significant (p &lt; 0.001).</w:t>
       </w:r>
     </w:p>
     <w:p>

</xml_diff>